<commit_message>
Update the setup guide for content-team 0.1.9
Text: draft-save confirmation prompt, the one-CMS-connection rule,
wildcard permission rules, repo push/branch rules, and the setup and
troubleshooting steps that depend on them. Diagrams redrawn: safety check
and Storyblok connection labels, and the release diagram's repository
name (was AIContentTeam-CMS). Ignore Word lock files (~$*).

Co-Authored-By: Claude Opus 5.5 <noreply@anthropic.com>
</commit_message>
<xml_diff>
--- a/AI Content Team for CMS — Setup Guide.docx
+++ b/AI Content Team for CMS — Setup Guide.docx
@@ -13,13 +13,7 @@
     <w:p>
       <w:pPr/>
       <w:r>
-        <w:t xml:space="preserve">Oct 14, 2026</w:t>
-      </w:r>
-      <w:r>
-        <w:t xml:space="preserve"> · </w:t>
-      </w:r>
-      <w:r>
-        <w:t xml:space="preserve">@Isaac</w:t>
+        <w:t xml:space="preserve">Oct 30, 2026 · @Isaac</w:t>
       </w:r>
     </w:p>
     <w:p>
@@ -161,7 +155,7 @@
         <w:t xml:space="preserve">Owner:</w:t>
       </w:r>
       <w:r>
-        <w:t xml:space="preserve"> Isaac Tay (@tayisaac) approves every change to the agents and the safety check. Current version: 0.1.8.</w:t>
+        <w:t xml:space="preserve"> Isaac Tay (@tayisaac) approves every change to the agents and the safety check. Current version: 0.1.9.</w:t>
       </w:r>
     </w:p>
     <w:p>
@@ -192,7 +186,7 @@
       <w:r>
         <w:drawing>
           <wp:inline distT="0" distB="0" distL="0" distR="0">
-            <wp:extent cx="5486400" cy="4906735"/>
+            <wp:extent cx="5486400" cy="5021036"/>
             <wp:docPr id="1" name="image1" descr="how a job flows · coordinator, agents, knowledge, CMS layer"/>
             <a:graphic xmlns:a="http://schemas.openxmlformats.org/drawingml/2006/main">
               <a:graphicData uri="http://schemas.openxmlformats.org/drawingml/2006/picture">
@@ -210,7 +204,7 @@
                   <pic:spPr>
                     <a:xfrm>
                       <a:off x="0" y="0"/>
-                      <a:ext cx="5486400" cy="4906735"/>
+                      <a:ext cx="5486400" cy="5021036"/>
                     </a:xfrm>
                     <a:prstGeom prst="rect">
                       <a:avLst/>
@@ -880,6 +874,9 @@
       <w:r>
         <w:t xml:space="preserve"> A safety check runs before every CMS write. It allows only saving a story as a draft and blocks publishing, unpublishing, scheduling, deleting, image uploads, component or settings changes and AI translation. If it can't read a call, it blocks it. It needs python3 on the machine.</w:t>
       </w:r>
+      <w:r>
+        <w:t xml:space="preserve"> Every draft save it allows also shows you a confirmation prompt, whatever the CMS connection is called.</w:t>
+      </w:r>
     </w:p>
     <w:p>
       <w:pPr>
@@ -978,6 +975,51 @@
       </w:r>
       <w:r>
         <w:t xml:space="preserve"> tag; existing tags are kept.</w:t>
+      </w:r>
+    </w:p>
+    <w:p>
+      <w:pPr>
+        <w:pStyle w:val="ListParagraph"/>
+        <w:numPr>
+          <w:ilvl w:val="0"/>
+          <w:numId w:val="4"/>
+        </w:numPr>
+      </w:pPr>
+      <w:r>
+        <w:rPr>
+          <w:b/>
+        </w:rPr>
+        <w:t xml:space="preserve">One CMS connection.</w:t>
+      </w:r>
+      <w:r>
+        <w:t xml:space="preserve"> In Claude Code, Storyblok is connected only through the workspace's </w:t>
+      </w:r>
+      <w:r>
+        <w:rPr>
+          <w:rStyle w:val="CodeChar"/>
+        </w:rPr>
+        <w:t xml:space="preserve">.mcp.json</w:t>
+      </w:r>
+      <w:r>
+        <w:t xml:space="preserve"> (server name </w:t>
+      </w:r>
+      <w:r>
+        <w:rPr>
+          <w:rStyle w:val="CodeChar"/>
+        </w:rPr>
+        <w:t xml:space="preserve">Storyblok</w:t>
+      </w:r>
+      <w:r>
+        <w:t xml:space="preserve">). If its tools show up under another name, such as a connector named by an ID, the agents won't use them and the job stops until the connection is fixed. The workspace's ask and deny rules use wildcards (</w:t>
+      </w:r>
+      <w:r>
+        <w:rPr>
+          <w:rStyle w:val="CodeChar"/>
+        </w:rPr>
+        <w:t xml:space="preserve">mcp__*__…</w:t>
+      </w:r>
+      <w:r>
+        <w:t xml:space="preserve">), so they cover the CMS under any name.</w:t>
       </w:r>
     </w:p>
     <w:p>
@@ -1594,7 +1636,7 @@
         <w:t xml:space="preserve">python3 scripts/validate.py</w:t>
       </w:r>
       <w:r>
-        <w:t xml:space="preserve">. It also tests the safety check against 10 cases.</w:t>
+        <w:t xml:space="preserve">. It also tests the safety check against 12 cases and checks the workspace permission rules.</w:t>
       </w:r>
     </w:p>
     <w:p>
@@ -1999,6 +2041,45 @@
         </w:numPr>
       </w:pPr>
       <w:r>
+        <w:t xml:space="preserve">Claude Code sessions in the repository ask before every push and can't force-push, delete a branch on GitHub or delete the repository (</w:t>
+      </w:r>
+      <w:r>
+        <w:rPr>
+          <w:rStyle w:val="CodeChar"/>
+        </w:rPr>
+        <w:t xml:space="preserve">.claude/settings.json</w:t>
+      </w:r>
+      <w:r>
+        <w:t xml:space="preserve">). </w:t>
+      </w:r>
+      <w:r>
+        <w:rPr>
+          <w:rStyle w:val="CodeChar"/>
+        </w:rPr>
+        <w:t xml:space="preserve">CLAUDE.md</w:t>
+      </w:r>
+      <w:r>
+        <w:t xml:space="preserve"> tells Claude to branch and open a pull request instead of committing on </w:t>
+      </w:r>
+      <w:r>
+        <w:rPr>
+          <w:rStyle w:val="CodeChar"/>
+        </w:rPr>
+        <w:t xml:space="preserve">main</w:t>
+      </w:r>
+      <w:r>
+        <w:t xml:space="preserve">.</w:t>
+      </w:r>
+    </w:p>
+    <w:p>
+      <w:pPr>
+        <w:pStyle w:val="ListParagraph"/>
+        <w:numPr>
+          <w:ilvl w:val="0"/>
+          <w:numId w:val="6"/>
+        </w:numPr>
+      </w:pPr>
+      <w:r>
         <w:rPr>
           <w:rStyle w:val="CodeChar"/>
         </w:rPr>
@@ -2040,7 +2121,7 @@
         <w:t xml:space="preserve">docs/managed-settings.example.json</w:t>
       </w:r>
       <w:r>
-        <w:t xml:space="preserve"> in the repository): it registers the marketplace for everyone, turns on auto-update, enables content-team, allows only this marketplace and denies the CMS delete and upload tools whatever a workspace says.</w:t>
+        <w:t xml:space="preserve"> in the repository): it registers the marketplace for everyone, turns on auto-update, enables content-team, allows only this marketplace and denies the CMS delete and upload tools under any server name, whatever a workspace says.</w:t>
       </w:r>
     </w:p>
     <w:p>
@@ -2238,7 +2319,7 @@
         <w:t xml:space="preserve">Storyblok</w:t>
       </w:r>
       <w:r>
-        <w:t xml:space="preserve">: the agents use it.</w:t>
+        <w:t xml:space="preserve">: the agents and the workspace permissions use it.</w:t>
       </w:r>
     </w:p>
     <w:p>
@@ -2356,6 +2437,9 @@
       <w:r>
         <w:t xml:space="preserve">.</w:t>
       </w:r>
+      <w:r>
+        <w:t xml:space="preserve"> Use only this server: if you also connected Storyblok in the Claude app or on claude.ai, switch that connector off.</w:t>
+      </w:r>
     </w:p>
     <w:p>
       <w:pPr>
@@ -2398,6 +2482,18 @@
       <w:r>
         <w:t xml:space="preserve"> agents, six skills), then "try to publish a test story" (it must be blocked by the content-team safety check).</w:t>
       </w:r>
+      <w:r>
+        <w:t xml:space="preserve"> Saving a draft must show a confirmation prompt labelled </w:t>
+      </w:r>
+      <w:r>
+        <w:rPr>
+          <w:rStyle w:val="CodeChar"/>
+        </w:rPr>
+        <w:t xml:space="preserve">[plugin:content-team]</w:t>
+      </w:r>
+      <w:r>
+        <w:t xml:space="preserve">.</w:t>
+      </w:r>
     </w:p>
     <w:p>
       <w:pPr>
@@ -2501,6 +2597,18 @@
       </w:pPr>
       <w:r>
         <w:t xml:space="preserve">Connect Storyblok in Settings → Connectors: read and write for stories; set publish-type actions to need approval or block them.</w:t>
+      </w:r>
+      <w:r>
+        <w:t xml:space="preserve"> It must appear as </w:t>
+      </w:r>
+      <w:r>
+        <w:rPr>
+          <w:rStyle w:val="CodeChar"/>
+        </w:rPr>
+        <w:t xml:space="preserve">Storyblok</w:t>
+      </w:r>
+      <w:r>
+        <w:t xml:space="preserve">; under any other name the workflows stop and ask you to fix it.</w:t>
       </w:r>
     </w:p>
     <w:p>
@@ -2966,7 +3074,7 @@
         <w:t xml:space="preserve">mockup.html</w:t>
       </w:r>
       <w:r>
-        <w:t xml:space="preserve"> in the run folder, then reply "approved" or ask for changes. Claude also asks you to allow the CMS call itself.</w:t>
+        <w:t xml:space="preserve"> in the run folder, then reply "approved" or ask for changes. Claude then asks you to allow the CMS call itself, in a prompt labelled [plugin:content-team] that names the page.</w:t>
       </w:r>
     </w:p>
     <w:p>
@@ -3295,6 +3403,9 @@
             <w:r>
               <w:t xml:space="preserve"> (or the Cowork connector)</w:t>
             </w:r>
+            <w:r>
+              <w:t xml:space="preserve">; under any other name the workflows stop and ask you to fix the connection</w:t>
+            </w:r>
           </w:p>
         </w:tc>
       </w:tr>
@@ -3341,13 +3452,7 @@
           <w:p>
             <w:pPr/>
             <w:r>
-              <w:t xml:space="preserve">Its tools have a personal ID in their names. Turn it off for Code sessions, or add ask/deny rules for it in </w:t>
-            </w:r>
-            <w:r>
-              <w:rPr>
-                <w:rStyle w:val="CodeChar"/>
-              </w:rPr>
-              <w:t xml:space="preserve">.claude/settings.local.json</w:t>
+              <w:t xml:space="preserve">Its tools have an ID in their names, which can differ per account. Turn it off for Code sessions. The agents won't use it, the workspace's wildcard ask and deny rules cover it, and the safety check asks before each draft save.</w:t>
             </w:r>
           </w:p>
         </w:tc>

</xml_diff>

<commit_message>
Update the setup guide for content-team 0.1.9 (#5)
Text: draft-save confirmation prompt, the one-CMS-connection rule,
wildcard permission rules, repo push/branch rules, and the setup and
troubleshooting steps that depend on them. Diagrams redrawn: safety check
and Storyblok connection labels, and the release diagram's repository
name (was AIContentTeam-CMS). Ignore Word lock files (~$*).

Co-authored-by: Claude Opus 5.5 <noreply@anthropic.com>
</commit_message>
<xml_diff>
--- a/AI Content Team for CMS — Setup Guide.docx
+++ b/AI Content Team for CMS — Setup Guide.docx
@@ -13,13 +13,7 @@
     <w:p>
       <w:pPr/>
       <w:r>
-        <w:t xml:space="preserve">Oct 14, 2026</w:t>
-      </w:r>
-      <w:r>
-        <w:t xml:space="preserve"> · </w:t>
-      </w:r>
-      <w:r>
-        <w:t xml:space="preserve">@Isaac</w:t>
+        <w:t xml:space="preserve">Oct 30, 2026 · @Isaac</w:t>
       </w:r>
     </w:p>
     <w:p>
@@ -161,7 +155,7 @@
         <w:t xml:space="preserve">Owner:</w:t>
       </w:r>
       <w:r>
-        <w:t xml:space="preserve"> Isaac Tay (@tayisaac) approves every change to the agents and the safety check. Current version: 0.1.8.</w:t>
+        <w:t xml:space="preserve"> Isaac Tay (@tayisaac) approves every change to the agents and the safety check. Current version: 0.1.9.</w:t>
       </w:r>
     </w:p>
     <w:p>
@@ -192,7 +186,7 @@
       <w:r>
         <w:drawing>
           <wp:inline distT="0" distB="0" distL="0" distR="0">
-            <wp:extent cx="5486400" cy="4906735"/>
+            <wp:extent cx="5486400" cy="5021036"/>
             <wp:docPr id="1" name="image1" descr="how a job flows · coordinator, agents, knowledge, CMS layer"/>
             <a:graphic xmlns:a="http://schemas.openxmlformats.org/drawingml/2006/main">
               <a:graphicData uri="http://schemas.openxmlformats.org/drawingml/2006/picture">
@@ -210,7 +204,7 @@
                   <pic:spPr>
                     <a:xfrm>
                       <a:off x="0" y="0"/>
-                      <a:ext cx="5486400" cy="4906735"/>
+                      <a:ext cx="5486400" cy="5021036"/>
                     </a:xfrm>
                     <a:prstGeom prst="rect">
                       <a:avLst/>
@@ -880,6 +874,9 @@
       <w:r>
         <w:t xml:space="preserve"> A safety check runs before every CMS write. It allows only saving a story as a draft and blocks publishing, unpublishing, scheduling, deleting, image uploads, component or settings changes and AI translation. If it can't read a call, it blocks it. It needs python3 on the machine.</w:t>
       </w:r>
+      <w:r>
+        <w:t xml:space="preserve"> Every draft save it allows also shows you a confirmation prompt, whatever the CMS connection is called.</w:t>
+      </w:r>
     </w:p>
     <w:p>
       <w:pPr>
@@ -978,6 +975,51 @@
       </w:r>
       <w:r>
         <w:t xml:space="preserve"> tag; existing tags are kept.</w:t>
+      </w:r>
+    </w:p>
+    <w:p>
+      <w:pPr>
+        <w:pStyle w:val="ListParagraph"/>
+        <w:numPr>
+          <w:ilvl w:val="0"/>
+          <w:numId w:val="4"/>
+        </w:numPr>
+      </w:pPr>
+      <w:r>
+        <w:rPr>
+          <w:b/>
+        </w:rPr>
+        <w:t xml:space="preserve">One CMS connection.</w:t>
+      </w:r>
+      <w:r>
+        <w:t xml:space="preserve"> In Claude Code, Storyblok is connected only through the workspace's </w:t>
+      </w:r>
+      <w:r>
+        <w:rPr>
+          <w:rStyle w:val="CodeChar"/>
+        </w:rPr>
+        <w:t xml:space="preserve">.mcp.json</w:t>
+      </w:r>
+      <w:r>
+        <w:t xml:space="preserve"> (server name </w:t>
+      </w:r>
+      <w:r>
+        <w:rPr>
+          <w:rStyle w:val="CodeChar"/>
+        </w:rPr>
+        <w:t xml:space="preserve">Storyblok</w:t>
+      </w:r>
+      <w:r>
+        <w:t xml:space="preserve">). If its tools show up under another name, such as a connector named by an ID, the agents won't use them and the job stops until the connection is fixed. The workspace's ask and deny rules use wildcards (</w:t>
+      </w:r>
+      <w:r>
+        <w:rPr>
+          <w:rStyle w:val="CodeChar"/>
+        </w:rPr>
+        <w:t xml:space="preserve">mcp__*__…</w:t>
+      </w:r>
+      <w:r>
+        <w:t xml:space="preserve">), so they cover the CMS under any name.</w:t>
       </w:r>
     </w:p>
     <w:p>
@@ -1594,7 +1636,7 @@
         <w:t xml:space="preserve">python3 scripts/validate.py</w:t>
       </w:r>
       <w:r>
-        <w:t xml:space="preserve">. It also tests the safety check against 10 cases.</w:t>
+        <w:t xml:space="preserve">. It also tests the safety check against 12 cases and checks the workspace permission rules.</w:t>
       </w:r>
     </w:p>
     <w:p>
@@ -1999,6 +2041,45 @@
         </w:numPr>
       </w:pPr>
       <w:r>
+        <w:t xml:space="preserve">Claude Code sessions in the repository ask before every push and can't force-push, delete a branch on GitHub or delete the repository (</w:t>
+      </w:r>
+      <w:r>
+        <w:rPr>
+          <w:rStyle w:val="CodeChar"/>
+        </w:rPr>
+        <w:t xml:space="preserve">.claude/settings.json</w:t>
+      </w:r>
+      <w:r>
+        <w:t xml:space="preserve">). </w:t>
+      </w:r>
+      <w:r>
+        <w:rPr>
+          <w:rStyle w:val="CodeChar"/>
+        </w:rPr>
+        <w:t xml:space="preserve">CLAUDE.md</w:t>
+      </w:r>
+      <w:r>
+        <w:t xml:space="preserve"> tells Claude to branch and open a pull request instead of committing on </w:t>
+      </w:r>
+      <w:r>
+        <w:rPr>
+          <w:rStyle w:val="CodeChar"/>
+        </w:rPr>
+        <w:t xml:space="preserve">main</w:t>
+      </w:r>
+      <w:r>
+        <w:t xml:space="preserve">.</w:t>
+      </w:r>
+    </w:p>
+    <w:p>
+      <w:pPr>
+        <w:pStyle w:val="ListParagraph"/>
+        <w:numPr>
+          <w:ilvl w:val="0"/>
+          <w:numId w:val="6"/>
+        </w:numPr>
+      </w:pPr>
+      <w:r>
         <w:rPr>
           <w:rStyle w:val="CodeChar"/>
         </w:rPr>
@@ -2040,7 +2121,7 @@
         <w:t xml:space="preserve">docs/managed-settings.example.json</w:t>
       </w:r>
       <w:r>
-        <w:t xml:space="preserve"> in the repository): it registers the marketplace for everyone, turns on auto-update, enables content-team, allows only this marketplace and denies the CMS delete and upload tools whatever a workspace says.</w:t>
+        <w:t xml:space="preserve"> in the repository): it registers the marketplace for everyone, turns on auto-update, enables content-team, allows only this marketplace and denies the CMS delete and upload tools under any server name, whatever a workspace says.</w:t>
       </w:r>
     </w:p>
     <w:p>
@@ -2238,7 +2319,7 @@
         <w:t xml:space="preserve">Storyblok</w:t>
       </w:r>
       <w:r>
-        <w:t xml:space="preserve">: the agents use it.</w:t>
+        <w:t xml:space="preserve">: the agents and the workspace permissions use it.</w:t>
       </w:r>
     </w:p>
     <w:p>
@@ -2356,6 +2437,9 @@
       <w:r>
         <w:t xml:space="preserve">.</w:t>
       </w:r>
+      <w:r>
+        <w:t xml:space="preserve"> Use only this server: if you also connected Storyblok in the Claude app or on claude.ai, switch that connector off.</w:t>
+      </w:r>
     </w:p>
     <w:p>
       <w:pPr>
@@ -2398,6 +2482,18 @@
       <w:r>
         <w:t xml:space="preserve"> agents, six skills), then "try to publish a test story" (it must be blocked by the content-team safety check).</w:t>
       </w:r>
+      <w:r>
+        <w:t xml:space="preserve"> Saving a draft must show a confirmation prompt labelled </w:t>
+      </w:r>
+      <w:r>
+        <w:rPr>
+          <w:rStyle w:val="CodeChar"/>
+        </w:rPr>
+        <w:t xml:space="preserve">[plugin:content-team]</w:t>
+      </w:r>
+      <w:r>
+        <w:t xml:space="preserve">.</w:t>
+      </w:r>
     </w:p>
     <w:p>
       <w:pPr>
@@ -2501,6 +2597,18 @@
       </w:pPr>
       <w:r>
         <w:t xml:space="preserve">Connect Storyblok in Settings → Connectors: read and write for stories; set publish-type actions to need approval or block them.</w:t>
+      </w:r>
+      <w:r>
+        <w:t xml:space="preserve"> It must appear as </w:t>
+      </w:r>
+      <w:r>
+        <w:rPr>
+          <w:rStyle w:val="CodeChar"/>
+        </w:rPr>
+        <w:t xml:space="preserve">Storyblok</w:t>
+      </w:r>
+      <w:r>
+        <w:t xml:space="preserve">; under any other name the workflows stop and ask you to fix it.</w:t>
       </w:r>
     </w:p>
     <w:p>
@@ -2966,7 +3074,7 @@
         <w:t xml:space="preserve">mockup.html</w:t>
       </w:r>
       <w:r>
-        <w:t xml:space="preserve"> in the run folder, then reply "approved" or ask for changes. Claude also asks you to allow the CMS call itself.</w:t>
+        <w:t xml:space="preserve"> in the run folder, then reply "approved" or ask for changes. Claude then asks you to allow the CMS call itself, in a prompt labelled [plugin:content-team] that names the page.</w:t>
       </w:r>
     </w:p>
     <w:p>
@@ -3295,6 +3403,9 @@
             <w:r>
               <w:t xml:space="preserve"> (or the Cowork connector)</w:t>
             </w:r>
+            <w:r>
+              <w:t xml:space="preserve">; under any other name the workflows stop and ask you to fix the connection</w:t>
+            </w:r>
           </w:p>
         </w:tc>
       </w:tr>
@@ -3341,13 +3452,7 @@
           <w:p>
             <w:pPr/>
             <w:r>
-              <w:t xml:space="preserve">Its tools have a personal ID in their names. Turn it off for Code sessions, or add ask/deny rules for it in </w:t>
-            </w:r>
-            <w:r>
-              <w:rPr>
-                <w:rStyle w:val="CodeChar"/>
-              </w:rPr>
-              <w:t xml:space="preserve">.claude/settings.local.json</w:t>
+              <w:t xml:space="preserve">Its tools have an ID in their names, which can differ per account. Turn it off for Code sessions. The agents won't use it, the workspace's wildcard ask and deny rules cover it, and the safety check asks before each draft save.</w:t>
             </w:r>
           </w:p>
         </w:tc>

</xml_diff>